<commit_message>
correcao no prompt e visual
</commit_message>
<xml_diff>
--- a/backend/templates/termo_declaracao.docx
+++ b/backend/templates/termo_declaracao.docx
@@ -855,9 +855,31 @@
           <w:color w:val="000000"/>
           <w:sz w:val="24"/>
           <w:szCs w:val="24"/>
+          <w:u w:val="single"/>
           <w:lang w:val="pt-BR"/>
         </w:rPr>
-        <w:t>declarando: {</w:t>
+        <w:t>D</w:t>
+      </w:r>
+      <w:r>
+        <w:rPr>
+          <w:rFonts w:ascii="Times New Roman" w:eastAsia="Times New Roman" w:hAnsi="Times New Roman" w:cs="Times New Roman"/>
+          <w:color w:val="000000"/>
+          <w:sz w:val="24"/>
+          <w:szCs w:val="24"/>
+          <w:u w:val="single"/>
+          <w:lang w:val="pt-BR"/>
+        </w:rPr>
+        <w:t>eclarando</w:t>
+      </w:r>
+      <w:r>
+        <w:rPr>
+          <w:rFonts w:ascii="Times New Roman" w:eastAsia="Times New Roman" w:hAnsi="Times New Roman" w:cs="Times New Roman"/>
+          <w:color w:val="000000"/>
+          <w:sz w:val="24"/>
+          <w:szCs w:val="24"/>
+          <w:lang w:val="pt-BR"/>
+        </w:rPr>
+        <w:t>: {</w:t>
       </w:r>
       <w:proofErr w:type="spellStart"/>
       <w:r>
@@ -901,6 +923,93 @@
           <w:lang w:val="pt-BR"/>
         </w:rPr>
       </w:pPr>
+      <w:r>
+        <w:rPr>
+          <w:rFonts w:ascii="Times New Roman" w:eastAsia="Times New Roman" w:hAnsi="Times New Roman" w:cs="Times New Roman"/>
+          <w:color w:val="000000"/>
+          <w:sz w:val="24"/>
+          <w:szCs w:val="24"/>
+        </w:rPr>
+        <w:t>{#HAS_</w:t>
+      </w:r>
+      <w:proofErr w:type="gramStart"/>
+      <w:r>
+        <w:rPr>
+          <w:rFonts w:ascii="Times New Roman" w:eastAsia="Times New Roman" w:hAnsi="Times New Roman" w:cs="Times New Roman"/>
+          <w:color w:val="000000"/>
+          <w:sz w:val="24"/>
+          <w:szCs w:val="24"/>
+        </w:rPr>
+        <w:t>GUARDA}</w:t>
+      </w:r>
+      <w:r>
+        <w:rPr>
+          <w:rFonts w:ascii="Times New Roman" w:eastAsia="Times New Roman" w:hAnsi="Times New Roman" w:cs="Times New Roman"/>
+          <w:color w:val="000000"/>
+          <w:sz w:val="24"/>
+          <w:szCs w:val="24"/>
+        </w:rPr>
+        <w:t>Guarda</w:t>
+      </w:r>
+      <w:proofErr w:type="gramEnd"/>
+      <w:r>
+        <w:rPr>
+          <w:rFonts w:ascii="Times New Roman" w:eastAsia="Times New Roman" w:hAnsi="Times New Roman" w:cs="Times New Roman"/>
+          <w:color w:val="000000"/>
+          <w:sz w:val="24"/>
+          <w:szCs w:val="24"/>
+        </w:rPr>
+        <w:t xml:space="preserve"> </w:t>
+      </w:r>
+      <w:proofErr w:type="spellStart"/>
+      <w:r>
+        <w:rPr>
+          <w:rFonts w:ascii="Times New Roman" w:eastAsia="Times New Roman" w:hAnsi="Times New Roman" w:cs="Times New Roman"/>
+          <w:color w:val="000000"/>
+          <w:sz w:val="24"/>
+          <w:szCs w:val="24"/>
+        </w:rPr>
+        <w:t>Convivência</w:t>
+      </w:r>
+      <w:proofErr w:type="spellEnd"/>
+      <w:r>
+        <w:rPr>
+          <w:rFonts w:ascii="Times New Roman" w:eastAsia="Times New Roman" w:hAnsi="Times New Roman" w:cs="Times New Roman"/>
+          <w:color w:val="000000"/>
+          <w:sz w:val="24"/>
+          <w:szCs w:val="24"/>
+        </w:rPr>
+        <w:t>:</w:t>
+      </w:r>
+      <w:r>
+        <w:rPr>
+          <w:rFonts w:ascii="Times New Roman" w:eastAsia="Times New Roman" w:hAnsi="Times New Roman" w:cs="Times New Roman"/>
+          <w:color w:val="000000"/>
+          <w:sz w:val="24"/>
+          <w:szCs w:val="24"/>
+        </w:rPr>
+        <w:t xml:space="preserve"> {</w:t>
+      </w:r>
+      <w:proofErr w:type="spellStart"/>
+      <w:r>
+        <w:rPr>
+          <w:rFonts w:ascii="Times New Roman" w:eastAsia="Times New Roman" w:hAnsi="Times New Roman" w:cs="Times New Roman"/>
+          <w:color w:val="000000"/>
+          <w:sz w:val="24"/>
+          <w:szCs w:val="24"/>
+        </w:rPr>
+        <w:t>guarda_convivencia</w:t>
+      </w:r>
+      <w:proofErr w:type="spellEnd"/>
+      <w:r>
+        <w:rPr>
+          <w:rFonts w:ascii="Times New Roman" w:eastAsia="Times New Roman" w:hAnsi="Times New Roman" w:cs="Times New Roman"/>
+          <w:color w:val="000000"/>
+          <w:sz w:val="24"/>
+          <w:szCs w:val="24"/>
+        </w:rPr>
+        <w:t>} {/HAS_GUARDA}</w:t>
+      </w:r>
     </w:p>
     <w:p>
       <w:pPr>

</xml_diff>